<commit_message>
Add CA3 final build files — app source, documents, and logs
Co-Authored-By: Claude Sonnet 4.6 <noreply@anthropic.com>
</commit_message>
<xml_diff>
--- a/CA3 Brief.docx
+++ b/CA3 Brief.docx
@@ -753,34 +753,19 @@
     <w:p>
       <w:pPr>
         <w:pStyle w:val="ListNumber"/>
-        <w:rPr>
-          <w:highlight w:val="green"/>
-        </w:rPr>
-      </w:pPr>
-      <w:r>
-        <w:rPr>
-          <w:highlight w:val="green"/>
-        </w:rPr>
+      </w:pPr>
+      <w:r>
         <w:t>Accessibility plan (WCAG-aligned decisions: headings, labels, keyboard navigation, focus states, contrast)</w:t>
       </w:r>
       <w:r>
-        <w:rPr>
-          <w:highlight w:val="green"/>
-        </w:rPr>
         <w:t xml:space="preserve"> (</w:t>
       </w:r>
       <w:proofErr w:type="spellStart"/>
       <w:r>
-        <w:rPr>
-          <w:highlight w:val="green"/>
-        </w:rPr>
         <w:t>brian</w:t>
       </w:r>
       <w:proofErr w:type="spellEnd"/>
       <w:r>
-        <w:rPr>
-          <w:highlight w:val="green"/>
-        </w:rPr>
         <w:t>)</w:t>
       </w:r>
     </w:p>
@@ -789,13 +774,7 @@
         <w:pStyle w:val="ListNumber"/>
       </w:pPr>
       <w:r>
-        <w:rPr>
-          <w:highlight w:val="green"/>
-        </w:rPr>
-        <w:t>Privacy, security, and compliance</w:t>
-      </w:r>
-      <w:r>
-        <w:t xml:space="preserve"> (GDPR basics: lawful basis conceptually, </w:t>
+        <w:t xml:space="preserve">Privacy, security, and compliance (GDPR basics: lawful basis conceptually, </w:t>
       </w:r>
       <w:proofErr w:type="spellStart"/>
       <w:r>
@@ -890,55 +869,6 @@
       <w:r>
         <w:t>Component 2 – AI-assisted application build (25%)</w:t>
       </w:r>
-      <w:r>
-        <w:t xml:space="preserve"> </w:t>
-      </w:r>
-      <w:r>
-        <w:rPr>
-          <w:noProof/>
-        </w:rPr>
-        <w:drawing>
-          <wp:inline distT="0" distB="0" distL="0" distR="0" wp14:anchorId="5210AF04" wp14:editId="00962A0D">
-            <wp:extent cx="462013" cy="462013"/>
-            <wp:effectExtent l="0" t="0" r="0" b="0"/>
-            <wp:docPr id="1676172205" name="Graphic 1" descr="Badge Tick1 with solid fill"/>
-            <wp:cNvGraphicFramePr>
-              <a:graphicFrameLocks xmlns:a="http://schemas.openxmlformats.org/drawingml/2006/main" noChangeAspect="1"/>
-            </wp:cNvGraphicFramePr>
-            <a:graphic xmlns:a="http://schemas.openxmlformats.org/drawingml/2006/main">
-              <a:graphicData uri="http://schemas.openxmlformats.org/drawingml/2006/picture">
-                <pic:pic xmlns:pic="http://schemas.openxmlformats.org/drawingml/2006/picture">
-                  <pic:nvPicPr>
-                    <pic:cNvPr id="1676172205" name="Graphic 1676172205" descr="Badge Tick1 with solid fill"/>
-                    <pic:cNvPicPr/>
-                  </pic:nvPicPr>
-                  <pic:blipFill>
-                    <a:blip r:embed="rId7">
-                      <a:extLst>
-                        <a:ext uri="{96DAC541-7B7A-43D3-8B79-37D633B846F1}">
-                          <asvg:svgBlip xmlns:asvg="http://schemas.microsoft.com/office/drawing/2016/SVG/main" r:embed="rId8"/>
-                        </a:ext>
-                      </a:extLst>
-                    </a:blip>
-                    <a:stretch>
-                      <a:fillRect/>
-                    </a:stretch>
-                  </pic:blipFill>
-                  <pic:spPr>
-                    <a:xfrm>
-                      <a:off x="0" y="0"/>
-                      <a:ext cx="464324" cy="464324"/>
-                    </a:xfrm>
-                    <a:prstGeom prst="rect">
-                      <a:avLst/>
-                    </a:prstGeom>
-                  </pic:spPr>
-                </pic:pic>
-              </a:graphicData>
-            </a:graphic>
-          </wp:inline>
-        </w:drawing>
-      </w:r>
     </w:p>
     <w:p>
       <w:pPr>
@@ -993,58 +923,6 @@
       <w:r>
         <w:t>Minimum expected features (choose at least 4; more is fine)</w:t>
       </w:r>
-      <w:r>
-        <w:rPr>
-          <w:noProof/>
-        </w:rPr>
-        <w:t xml:space="preserve"> </w:t>
-      </w:r>
-      <w:r>
-        <w:rPr>
-          <w:noProof/>
-        </w:rPr>
-        <w:drawing>
-          <wp:inline distT="0" distB="0" distL="0" distR="0" wp14:anchorId="0088CDC3" wp14:editId="1B4A71AE">
-            <wp:extent cx="462013" cy="462013"/>
-            <wp:effectExtent l="0" t="0" r="0" b="0"/>
-            <wp:docPr id="626226106" name="Graphic 1" descr="Badge Tick1 with solid fill"/>
-            <wp:cNvGraphicFramePr>
-              <a:graphicFrameLocks xmlns:a="http://schemas.openxmlformats.org/drawingml/2006/main" noChangeAspect="1"/>
-            </wp:cNvGraphicFramePr>
-            <a:graphic xmlns:a="http://schemas.openxmlformats.org/drawingml/2006/main">
-              <a:graphicData uri="http://schemas.openxmlformats.org/drawingml/2006/picture">
-                <pic:pic xmlns:pic="http://schemas.openxmlformats.org/drawingml/2006/picture">
-                  <pic:nvPicPr>
-                    <pic:cNvPr id="1676172205" name="Graphic 1676172205" descr="Badge Tick1 with solid fill"/>
-                    <pic:cNvPicPr/>
-                  </pic:nvPicPr>
-                  <pic:blipFill>
-                    <a:blip r:embed="rId7">
-                      <a:extLst>
-                        <a:ext uri="{96DAC541-7B7A-43D3-8B79-37D633B846F1}">
-                          <asvg:svgBlip xmlns:asvg="http://schemas.microsoft.com/office/drawing/2016/SVG/main" r:embed="rId8"/>
-                        </a:ext>
-                      </a:extLst>
-                    </a:blip>
-                    <a:stretch>
-                      <a:fillRect/>
-                    </a:stretch>
-                  </pic:blipFill>
-                  <pic:spPr>
-                    <a:xfrm>
-                      <a:off x="0" y="0"/>
-                      <a:ext cx="464324" cy="464324"/>
-                    </a:xfrm>
-                    <a:prstGeom prst="rect">
-                      <a:avLst/>
-                    </a:prstGeom>
-                  </pic:spPr>
-                </pic:pic>
-              </a:graphicData>
-            </a:graphic>
-          </wp:inline>
-        </w:drawing>
-      </w:r>
     </w:p>
     <w:p>
       <w:pPr>
@@ -1169,9 +1047,6 @@
       </w:r>
       <w:r>
         <w:br/>
-      </w:r>
-      <w:r>
-        <w:lastRenderedPageBreak/>
         <w:t>TASK: [describe one small task, e.g., create the Events page with filtering]</w:t>
       </w:r>
       <w:r>
@@ -1188,6 +1063,7 @@
         <w:pStyle w:val="Heading2"/>
       </w:pPr>
       <w:r>
+        <w:lastRenderedPageBreak/>
         <w:t>What to submit for this component</w:t>
       </w:r>
     </w:p>
@@ -1441,7 +1317,6 @@
         <w:pStyle w:val="Heading1"/>
       </w:pPr>
       <w:r>
-        <w:lastRenderedPageBreak/>
         <w:t>Component 5 – Accessibility and user testing (10%)</w:t>
       </w:r>
     </w:p>
@@ -1466,6 +1341,7 @@
         <w:pStyle w:val="ListBullet"/>
       </w:pPr>
       <w:r>
+        <w:lastRenderedPageBreak/>
         <w:t>Record issues found and the changes you made.</w:t>
       </w:r>
     </w:p>
@@ -2084,7 +1960,7 @@
   <w:abstractNum w:abstractNumId="7" w15:restartNumberingAfterBreak="0">
     <w:nsid w:val="FFFFFF88"/>
     <w:multiLevelType w:val="singleLevel"/>
-    <w:tmpl w:val="D21867C2"/>
+    <w:tmpl w:val="D0A62B40"/>
     <w:lvl w:ilvl="0">
       <w:start w:val="1"/>
       <w:numFmt w:val="decimal"/>
@@ -2102,7 +1978,7 @@
   <w:abstractNum w:abstractNumId="8" w15:restartNumberingAfterBreak="0">
     <w:nsid w:val="FFFFFF89"/>
     <w:multiLevelType w:val="singleLevel"/>
-    <w:tmpl w:val="4568348E"/>
+    <w:tmpl w:val="29761A62"/>
     <w:lvl w:ilvl="0">
       <w:start w:val="1"/>
       <w:numFmt w:val="bullet"/>
@@ -2146,12 +2022,6 @@
   </w:num>
   <w:num w:numId="9" w16cid:durableId="1463764559">
     <w:abstractNumId w:val="0"/>
-  </w:num>
-  <w:num w:numId="10" w16cid:durableId="983124151">
-    <w:abstractNumId w:val="7"/>
-  </w:num>
-  <w:num w:numId="11" w16cid:durableId="481970930">
-    <w:abstractNumId w:val="7"/>
   </w:num>
 </w:numbering>
 </file>

</xml_diff>